<commit_message>
Refine Word documentation formatting
Update the Word exports to use the EOL Test Fixture title block, remove the generated-date line, and improve pagination so headings stay with their content.
</commit_message>
<xml_diff>
--- a/Docs/Word/C_Skills_Reference.docx
+++ b/Docs/Word/C_Skills_Reference.docx
@@ -6,16 +6,20 @@
       <w:pPr>
         <w:pStyle w:val="Title"/>
         <w:spacing w:before="0" w:after="160"/>
-        <w:jc w:val="center"/>
+        <w:jc w:val="left"/>
+        <w:keepNext/>
+        <w:keepLines/>
       </w:pPr>
       <w:r>
-        <w:t>Project Firmware And Maintenance Reference</w:t>
+        <w:t>EOL Test Fixture Firmware And Maintenance Reference</w:t>
       </w:r>
     </w:p>
     <w:p>
       <w:pPr>
         <w:pStyle w:val="Subtitle"/>
-        <w:jc w:val="center"/>
+        <w:jc w:val="left"/>
+        <w:keepNext/>
+        <w:keepLines/>
       </w:pPr>
       <w:r>
         <w:t>Rite-Hite EOL Test Fixture Documentation</w:t>
@@ -23,20 +27,11 @@
     </w:p>
     <w:p>
       <w:pPr>
-        <w:pStyle w:val="BodySmall"/>
-        <w:spacing w:before="0" w:after="360"/>
-        <w:jc w:val="center"/>
-      </w:pPr>
-      <w:r>
-        <w:t>Generated from current project markdown on April 16, 2026</w:t>
-      </w:r>
-    </w:p>
-    <w:p>
-      <w:pPr>
         <w:jc w:val="center"/>
         <w:pBdr>
           <w:bottom w:val="single" w:sz="12" w:space="1" w:color="C8102E"/>
         </w:pBdr>
+        <w:keepNext/>
       </w:pPr>
       <w:r>
         <w:rPr>
@@ -44,18 +39,6 @@
         </w:rPr>
         <w:t xml:space="preserve"> </w:t>
       </w:r>
-    </w:p>
-    <w:p>
-      <w:pPr>
-        <w:sectPr>
-          <w:headerReference w:type="default" r:id="rId9"/>
-          <w:footerReference w:type="default" r:id="rId10"/>
-          <w:pgSz w:w="12240" w:h="15840"/>
-          <w:pgMar w:top="1152" w:right="1224" w:bottom="1008" w:left="1224" w:header="504" w:footer="504" w:gutter="0"/>
-          <w:cols w:space="720"/>
-          <w:docGrid w:linePitch="360"/>
-        </w:sectPr>
-      </w:pPr>
     </w:p>
     <w:p>
       <w:pPr>
@@ -129,6 +112,7 @@
       <w:pPr>
         <w:pStyle w:val="Heading1"/>
         <w:spacing w:before="240" w:after="120"/>
+        <w:keepLines/>
       </w:pPr>
       <w:r>
         <w:t>1. File Ownership Map</w:t>
@@ -138,6 +122,7 @@
       <w:pPr>
         <w:pStyle w:val="Heading1"/>
         <w:spacing w:before="240" w:after="120"/>
+        <w:keepLines/>
       </w:pPr>
       <w:r>
         <w:t>STM32 Core Firmware</w:t>
@@ -658,11 +643,14 @@
         </w:tc>
       </w:tr>
     </w:tbl>
-    <w:p/>
+    <w:p>
+      <w:pPr/>
+    </w:p>
     <w:p>
       <w:pPr>
         <w:pStyle w:val="Heading1"/>
         <w:spacing w:before="240" w:after="120"/>
+        <w:keepLines/>
       </w:pPr>
       <w:r>
         <w:t>TouchGFX Layer</w:t>
@@ -933,11 +921,14 @@
         </w:tc>
       </w:tr>
     </w:tbl>
-    <w:p/>
+    <w:p>
+      <w:pPr/>
+    </w:p>
     <w:p>
       <w:pPr>
         <w:pStyle w:val="Heading1"/>
         <w:spacing w:before="240" w:after="120"/>
+        <w:keepLines/>
       </w:pPr>
       <w:r>
         <w:t>Desktop App</w:t>
@@ -1226,11 +1217,14 @@
         </w:tc>
       </w:tr>
     </w:tbl>
-    <w:p/>
+    <w:p>
+      <w:pPr/>
+    </w:p>
     <w:p>
       <w:pPr>
         <w:pStyle w:val="Heading1"/>
         <w:spacing w:before="240" w:after="120"/>
+        <w:keepLines/>
       </w:pPr>
       <w:r>
         <w:t>ESP32 Test Firmware</w:t>
@@ -1330,11 +1324,14 @@
         </w:tc>
       </w:tr>
     </w:tbl>
-    <w:p/>
+    <w:p>
+      <w:pPr/>
+    </w:p>
     <w:p>
       <w:pPr>
         <w:pStyle w:val="Heading1"/>
         <w:spacing w:before="240" w:after="120"/>
+        <w:keepLines/>
       </w:pPr>
       <w:r>
         <w:t>2. Common Change Map</w:t>
@@ -1344,6 +1341,8 @@
       <w:pPr>
         <w:pStyle w:val="Heading1"/>
         <w:spacing w:before="240" w:after="120"/>
+        <w:keepNext/>
+        <w:keepLines/>
       </w:pPr>
       <w:r>
         <w:t>If You Need To Change A Fault Code</w:t>
@@ -1352,6 +1351,8 @@
     <w:p>
       <w:pPr>
         <w:spacing w:before="0" w:after="120" w:line="240" w:lineRule="auto"/>
+        <w:keepLines/>
+        <w:keepNext/>
       </w:pPr>
       <w:r>
         <w:t>Update:</w:t>
@@ -1360,6 +1361,8 @@
     <w:p>
       <w:pPr>
         <w:ind w:left="0" w:hanging="230"/>
+        <w:keepLines/>
+        <w:keepNext/>
       </w:pPr>
       <w:r>
         <w:rPr>
@@ -1381,6 +1384,8 @@
     <w:p>
       <w:pPr>
         <w:ind w:left="0" w:hanging="230"/>
+        <w:keepLines/>
+        <w:keepNext/>
       </w:pPr>
       <w:r>
         <w:rPr>
@@ -1397,6 +1402,8 @@
     <w:p>
       <w:pPr>
         <w:ind w:left="0" w:hanging="230"/>
+        <w:keepLines/>
+        <w:keepNext/>
       </w:pPr>
       <w:r>
         <w:rPr>
@@ -1413,6 +1420,8 @@
     <w:p>
       <w:pPr>
         <w:ind w:left="0" w:hanging="230"/>
+        <w:keepLines/>
+        <w:keepNext/>
       </w:pPr>
       <w:r>
         <w:rPr>
@@ -1434,6 +1443,7 @@
     <w:p>
       <w:pPr>
         <w:ind w:left="0" w:hanging="230"/>
+        <w:keepLines/>
       </w:pPr>
       <w:r>
         <w:rPr>
@@ -1459,6 +1469,8 @@
       <w:pPr>
         <w:pStyle w:val="Heading1"/>
         <w:spacing w:before="240" w:after="120"/>
+        <w:keepNext/>
+        <w:keepLines/>
       </w:pPr>
       <w:r>
         <w:t>If You Need To Change The One Click Progress Rail</w:t>
@@ -1467,6 +1479,8 @@
     <w:p>
       <w:pPr>
         <w:spacing w:before="0" w:after="120" w:line="240" w:lineRule="auto"/>
+        <w:keepLines/>
+        <w:keepNext/>
       </w:pPr>
       <w:r>
         <w:t>Update:</w:t>
@@ -1475,6 +1489,8 @@
     <w:p>
       <w:pPr>
         <w:ind w:left="0" w:hanging="230"/>
+        <w:keepLines/>
+        <w:keepNext/>
       </w:pPr>
       <w:r>
         <w:rPr>
@@ -1499,6 +1515,8 @@
     <w:p>
       <w:pPr>
         <w:ind w:left="0" w:hanging="230"/>
+        <w:keepLines/>
+        <w:keepNext/>
       </w:pPr>
       <w:r>
         <w:rPr>
@@ -1523,6 +1541,8 @@
     <w:p>
       <w:pPr>
         <w:ind w:left="0" w:hanging="230"/>
+        <w:keepLines/>
+        <w:keepNext/>
       </w:pPr>
       <w:r>
         <w:rPr>
@@ -1547,6 +1567,8 @@
     <w:p>
       <w:pPr>
         <w:ind w:left="0" w:hanging="230"/>
+        <w:keepLines/>
+        <w:keepNext/>
       </w:pPr>
       <w:r>
         <w:rPr>
@@ -1571,6 +1593,7 @@
     <w:p>
       <w:pPr>
         <w:ind w:left="0" w:hanging="230"/>
+        <w:keepLines/>
       </w:pPr>
       <w:r>
         <w:rPr>
@@ -1604,6 +1627,8 @@
       <w:pPr>
         <w:pStyle w:val="Heading1"/>
         <w:spacing w:before="240" w:after="120"/>
+        <w:keepNext/>
+        <w:keepLines/>
       </w:pPr>
       <w:r>
         <w:t>If You Need To Change Export Behavior</w:t>
@@ -1612,6 +1637,8 @@
     <w:p>
       <w:pPr>
         <w:spacing w:before="0" w:after="120" w:line="240" w:lineRule="auto"/>
+        <w:keepLines/>
+        <w:keepNext/>
       </w:pPr>
       <w:r>
         <w:t>Update:</w:t>
@@ -1620,6 +1647,8 @@
     <w:p>
       <w:pPr>
         <w:ind w:left="0" w:hanging="230"/>
+        <w:keepLines/>
+        <w:keepNext/>
       </w:pPr>
       <w:r>
         <w:rPr>
@@ -1644,6 +1673,8 @@
     <w:p>
       <w:pPr>
         <w:ind w:left="0" w:hanging="230"/>
+        <w:keepLines/>
+        <w:keepNext/>
       </w:pPr>
       <w:r>
         <w:rPr>
@@ -1668,6 +1699,8 @@
     <w:p>
       <w:pPr>
         <w:ind w:left="0" w:hanging="230"/>
+        <w:keepLines/>
+        <w:keepNext/>
       </w:pPr>
       <w:r>
         <w:rPr>
@@ -1692,6 +1725,8 @@
     <w:p>
       <w:pPr>
         <w:ind w:left="0" w:hanging="230"/>
+        <w:keepLines/>
+        <w:keepNext/>
       </w:pPr>
       <w:r>
         <w:rPr>
@@ -1716,6 +1751,7 @@
     <w:p>
       <w:pPr>
         <w:ind w:left="0" w:hanging="230"/>
+        <w:keepLines/>
       </w:pPr>
       <w:r>
         <w:rPr>
@@ -1733,6 +1769,8 @@
       <w:pPr>
         <w:pStyle w:val="Heading1"/>
         <w:spacing w:before="240" w:after="120"/>
+        <w:keepNext/>
+        <w:keepLines/>
       </w:pPr>
       <w:r>
         <w:t>If You Need To Change The Button / LED Stage</w:t>
@@ -1741,6 +1779,8 @@
     <w:p>
       <w:pPr>
         <w:spacing w:before="0" w:after="120" w:line="240" w:lineRule="auto"/>
+        <w:keepLines/>
+        <w:keepNext/>
       </w:pPr>
       <w:r>
         <w:t>Update:</w:t>
@@ -1749,6 +1789,8 @@
     <w:p>
       <w:pPr>
         <w:ind w:left="0" w:hanging="230"/>
+        <w:keepLines/>
+        <w:keepNext/>
       </w:pPr>
       <w:r>
         <w:rPr>
@@ -1770,6 +1812,8 @@
     <w:p>
       <w:pPr>
         <w:ind w:left="0" w:hanging="230"/>
+        <w:keepLines/>
+        <w:keepNext/>
       </w:pPr>
       <w:r>
         <w:rPr>
@@ -1791,6 +1835,8 @@
     <w:p>
       <w:pPr>
         <w:ind w:left="0" w:hanging="230"/>
+        <w:keepLines/>
+        <w:keepNext/>
       </w:pPr>
       <w:r>
         <w:rPr>
@@ -1812,6 +1858,8 @@
     <w:p>
       <w:pPr>
         <w:ind w:left="0" w:hanging="230"/>
+        <w:keepLines/>
+        <w:keepNext/>
       </w:pPr>
       <w:r>
         <w:rPr>
@@ -1833,6 +1881,8 @@
     <w:p>
       <w:pPr>
         <w:ind w:left="0" w:hanging="230"/>
+        <w:keepLines/>
+        <w:keepNext/>
       </w:pPr>
       <w:r>
         <w:rPr>
@@ -1857,6 +1907,7 @@
     <w:p>
       <w:pPr>
         <w:ind w:left="0" w:hanging="230"/>
+        <w:keepLines/>
       </w:pPr>
       <w:r>
         <w:rPr>
@@ -1874,6 +1925,7 @@
       <w:pPr>
         <w:pStyle w:val="Heading1"/>
         <w:spacing w:before="240" w:after="120"/>
+        <w:keepLines/>
       </w:pPr>
       <w:r>
         <w:t>3. Current Protocol Quick Reference</w:t>
@@ -1883,6 +1935,8 @@
       <w:pPr>
         <w:pStyle w:val="Heading1"/>
         <w:spacing w:before="240" w:after="120"/>
+        <w:keepNext/>
+        <w:keepLines/>
       </w:pPr>
       <w:r>
         <w:t>STM32 To ESP32 Core Tokens</w:t>
@@ -1891,6 +1945,7 @@
     <w:p>
       <w:pPr>
         <w:pStyle w:val="ListBullet"/>
+        <w:keepLines/>
       </w:pPr>
       <w:r>
         <w:rPr>
@@ -2074,6 +2129,8 @@
       <w:pPr>
         <w:pStyle w:val="Heading1"/>
         <w:spacing w:before="240" w:after="120"/>
+        <w:keepNext/>
+        <w:keepLines/>
       </w:pPr>
       <w:r>
         <w:t>Expected ESP32 Replies</w:t>
@@ -2082,6 +2139,7 @@
     <w:p>
       <w:pPr>
         <w:pStyle w:val="ListBullet"/>
+        <w:keepLines/>
       </w:pPr>
       <w:r>
         <w:rPr>
@@ -2262,6 +2320,8 @@
       <w:pPr>
         <w:pStyle w:val="Heading1"/>
         <w:spacing w:before="240" w:after="120"/>
+        <w:keepNext/>
+        <w:keepLines/>
       </w:pPr>
       <w:r>
         <w:t>Desktop App To Fixture Tokens</w:t>
@@ -2270,6 +2330,8 @@
     <w:p>
       <w:pPr>
         <w:pStyle w:val="ListBullet"/>
+        <w:keepLines/>
+        <w:keepNext/>
       </w:pPr>
       <w:r>
         <w:rPr>
@@ -2283,6 +2345,8 @@
     <w:p>
       <w:pPr>
         <w:pStyle w:val="ListBullet"/>
+        <w:keepLines/>
+        <w:keepNext/>
       </w:pPr>
       <w:r>
         <w:rPr>
@@ -2296,6 +2360,7 @@
     <w:p>
       <w:pPr>
         <w:pStyle w:val="ListBullet"/>
+        <w:keepLines/>
       </w:pPr>
       <w:r>
         <w:rPr>
@@ -2310,6 +2375,8 @@
       <w:pPr>
         <w:pStyle w:val="Heading1"/>
         <w:spacing w:before="240" w:after="120"/>
+        <w:keepNext/>
+        <w:keepLines/>
       </w:pPr>
       <w:r>
         <w:t>Fixture To Desktop App Replies</w:t>
@@ -2318,6 +2385,8 @@
     <w:p>
       <w:pPr>
         <w:pStyle w:val="ListBullet"/>
+        <w:keepLines/>
+        <w:keepNext/>
       </w:pPr>
       <w:r>
         <w:rPr>
@@ -2331,6 +2400,8 @@
     <w:p>
       <w:pPr>
         <w:pStyle w:val="ListBullet"/>
+        <w:keepLines/>
+        <w:keepNext/>
       </w:pPr>
       <w:r>
         <w:rPr>
@@ -2344,6 +2415,8 @@
     <w:p>
       <w:pPr>
         <w:pStyle w:val="ListBullet"/>
+        <w:keepLines/>
+        <w:keepNext/>
       </w:pPr>
       <w:r>
         <w:rPr>
@@ -2357,6 +2430,8 @@
     <w:p>
       <w:pPr>
         <w:pStyle w:val="ListBullet"/>
+        <w:keepLines/>
+        <w:keepNext/>
       </w:pPr>
       <w:r>
         <w:rPr>
@@ -2370,6 +2445,8 @@
     <w:p>
       <w:pPr>
         <w:pStyle w:val="ListBullet"/>
+        <w:keepLines/>
+        <w:keepNext/>
       </w:pPr>
       <w:r>
         <w:rPr>
@@ -2383,6 +2460,8 @@
     <w:p>
       <w:pPr>
         <w:pStyle w:val="ListBullet"/>
+        <w:keepLines/>
+        <w:keepNext/>
       </w:pPr>
       <w:r>
         <w:rPr>
@@ -2396,6 +2475,7 @@
     <w:p>
       <w:pPr>
         <w:pStyle w:val="ListBullet"/>
+        <w:keepLines/>
       </w:pPr>
       <w:r>
         <w:rPr>
@@ -2410,6 +2490,7 @@
       <w:pPr>
         <w:pStyle w:val="Heading1"/>
         <w:spacing w:before="240" w:after="120"/>
+        <w:keepLines/>
       </w:pPr>
       <w:r>
         <w:t>4. Current Test Ownership Notes</w:t>
@@ -2419,6 +2500,8 @@
       <w:pPr>
         <w:pStyle w:val="Heading1"/>
         <w:spacing w:before="240" w:after="120"/>
+        <w:keepNext/>
+        <w:keepLines/>
       </w:pPr>
       <w:r>
         <w:t>Communication / Reset / Fault Check</w:t>
@@ -2427,6 +2510,8 @@
     <w:p>
       <w:pPr>
         <w:pStyle w:val="ListBullet"/>
+        <w:keepLines/>
+        <w:keepNext/>
       </w:pPr>
       <w:r>
         <w:t xml:space="preserve">Single state machine in </w:t>
@@ -2443,6 +2528,7 @@
     <w:p>
       <w:pPr>
         <w:pStyle w:val="ListBullet"/>
+        <w:keepLines/>
       </w:pPr>
       <w:r>
         <w:t xml:space="preserve">Fault family: </w:t>
@@ -2482,6 +2568,8 @@
       <w:pPr>
         <w:pStyle w:val="Heading1"/>
         <w:spacing w:before="240" w:after="120"/>
+        <w:keepNext/>
+        <w:keepLines/>
       </w:pPr>
       <w:r>
         <w:t>Digital Inputs</w:t>
@@ -2490,6 +2578,8 @@
     <w:p>
       <w:pPr>
         <w:pStyle w:val="ListBullet"/>
+        <w:keepLines/>
+        <w:keepNext/>
       </w:pPr>
       <w:r>
         <w:t>12 channels</w:t>
@@ -2498,6 +2588,8 @@
     <w:p>
       <w:pPr>
         <w:pStyle w:val="ListBullet"/>
+        <w:keepLines/>
+        <w:keepNext/>
       </w:pPr>
       <w:r>
         <w:t xml:space="preserve">Expected result text: </w:t>
@@ -2514,6 +2606,7 @@
     <w:p>
       <w:pPr>
         <w:pStyle w:val="ListBullet"/>
+        <w:keepLines/>
       </w:pPr>
       <w:r>
         <w:t xml:space="preserve">Fault family: </w:t>
@@ -2531,6 +2624,8 @@
       <w:pPr>
         <w:pStyle w:val="Heading1"/>
         <w:spacing w:before="240" w:after="120"/>
+        <w:keepNext/>
+        <w:keepLines/>
       </w:pPr>
       <w:r>
         <w:t>Analog Inputs</w:t>
@@ -2539,6 +2634,8 @@
     <w:p>
       <w:pPr>
         <w:pStyle w:val="ListBullet"/>
+        <w:keepLines/>
+        <w:keepNext/>
       </w:pPr>
       <w:r>
         <w:t>4 channels</w:t>
@@ -2547,6 +2644,8 @@
     <w:p>
       <w:pPr>
         <w:pStyle w:val="ListBullet"/>
+        <w:keepLines/>
+        <w:keepNext/>
       </w:pPr>
       <w:r>
         <w:t>3 levels per channel</w:t>
@@ -2555,6 +2654,7 @@
     <w:p>
       <w:pPr>
         <w:pStyle w:val="ListBullet"/>
+        <w:keepLines/>
       </w:pPr>
       <w:r>
         <w:t xml:space="preserve">Fault family: </w:t>
@@ -2572,6 +2672,8 @@
       <w:pPr>
         <w:pStyle w:val="Heading1"/>
         <w:spacing w:before="240" w:after="120"/>
+        <w:keepNext/>
+        <w:keepLines/>
       </w:pPr>
       <w:r>
         <w:t>Outputs</w:t>
@@ -2580,6 +2682,8 @@
     <w:p>
       <w:pPr>
         <w:pStyle w:val="ListBullet"/>
+        <w:keepLines/>
+        <w:keepNext/>
       </w:pPr>
       <w:r>
         <w:t>DO1 and DO2 are temporary auto-pass rows</w:t>
@@ -2588,6 +2692,8 @@
     <w:p>
       <w:pPr>
         <w:pStyle w:val="ListBullet"/>
+        <w:keepLines/>
+        <w:keepNext/>
       </w:pPr>
       <w:r>
         <w:t>Relay verification is live</w:t>
@@ -2596,6 +2702,7 @@
     <w:p>
       <w:pPr>
         <w:pStyle w:val="ListBullet"/>
+        <w:keepLines/>
       </w:pPr>
       <w:r>
         <w:t xml:space="preserve">Fault family: </w:t>
@@ -2613,6 +2720,8 @@
       <w:pPr>
         <w:pStyle w:val="Heading1"/>
         <w:spacing w:before="240" w:after="120"/>
+        <w:keepNext/>
+        <w:keepLines/>
       </w:pPr>
       <w:r>
         <w:t>Buttons / LEDs</w:t>
@@ -2621,6 +2730,8 @@
     <w:p>
       <w:pPr>
         <w:pStyle w:val="ListBullet"/>
+        <w:keepLines/>
+        <w:keepNext/>
       </w:pPr>
       <w:r>
         <w:t>Button actuation is automatic</w:t>
@@ -2629,6 +2740,8 @@
     <w:p>
       <w:pPr>
         <w:pStyle w:val="ListBullet"/>
+        <w:keepLines/>
+        <w:keepNext/>
       </w:pPr>
       <w:r>
         <w:t>LED visual decision is manual</w:t>
@@ -2637,6 +2750,7 @@
     <w:p>
       <w:pPr>
         <w:pStyle w:val="ListBullet"/>
+        <w:keepLines/>
       </w:pPr>
       <w:r>
         <w:t xml:space="preserve">Fault family: </w:t>
@@ -2654,6 +2768,8 @@
       <w:pPr>
         <w:pStyle w:val="Heading1"/>
         <w:spacing w:before="240" w:after="120"/>
+        <w:keepNext/>
+        <w:keepLines/>
       </w:pPr>
       <w:r>
         <w:t>5. TouchGFX Integration Rules</w:t>
@@ -2662,6 +2778,8 @@
     <w:p>
       <w:pPr>
         <w:spacing w:before="0" w:after="120" w:line="240" w:lineRule="auto"/>
+        <w:keepLines/>
+        <w:keepNext/>
       </w:pPr>
       <w:r>
         <w:t>The current project uses the TouchGFX model as the coordinator between the non-blocking test engines and the screen presenters.</w:t>
@@ -2670,6 +2788,8 @@
     <w:p>
       <w:pPr>
         <w:spacing w:before="0" w:after="120" w:line="240" w:lineRule="auto"/>
+        <w:keepLines/>
+        <w:keepNext/>
       </w:pPr>
       <w:r>
         <w:t>Practical rules:</w:t>
@@ -2678,6 +2798,8 @@
     <w:p>
       <w:pPr>
         <w:pStyle w:val="ListBullet"/>
+        <w:keepLines/>
+        <w:keepNext/>
       </w:pPr>
       <w:r>
         <w:t>Start engines from presenters through model methods</w:t>
@@ -2686,6 +2808,8 @@
     <w:p>
       <w:pPr>
         <w:pStyle w:val="ListBullet"/>
+        <w:keepLines/>
+        <w:keepNext/>
       </w:pPr>
       <w:r>
         <w:t>Surface per-stage progress back through the model or container callbacks</w:t>
@@ -2694,6 +2818,8 @@
     <w:p>
       <w:pPr>
         <w:pStyle w:val="ListBullet"/>
+        <w:keepLines/>
+        <w:keepNext/>
       </w:pPr>
       <w:r>
         <w:t>Keep the report and fault ownership in the firmware engine, not in the container</w:t>
@@ -2702,6 +2828,8 @@
     <w:p>
       <w:pPr>
         <w:pStyle w:val="ListBullet"/>
+        <w:keepLines/>
+        <w:keepNext/>
       </w:pPr>
       <w:r>
         <w:t xml:space="preserve">Use </w:t>
@@ -2721,6 +2849,7 @@
     <w:p>
       <w:pPr>
         <w:pStyle w:val="ListBullet"/>
+        <w:keepLines/>
       </w:pPr>
       <w:r>
         <w:t>Keep One Click phase reporting aligned with actual engine state, not UI guesses</w:t>
@@ -2730,6 +2859,7 @@
       <w:pPr>
         <w:pStyle w:val="Heading1"/>
         <w:spacing w:before="240" w:after="120"/>
+        <w:keepLines/>
       </w:pPr>
       <w:r>
         <w:t>6. Desktop App Integration Rules</w:t>
@@ -2739,6 +2869,8 @@
       <w:pPr>
         <w:pStyle w:val="Heading1"/>
         <w:spacing w:before="240" w:after="120"/>
+        <w:keepNext/>
+        <w:keepLines/>
       </w:pPr>
       <w:r>
         <w:t>Serial Client</w:t>
@@ -2747,6 +2879,8 @@
     <w:p>
       <w:pPr>
         <w:spacing w:before="0" w:after="120" w:line="240" w:lineRule="auto"/>
+        <w:keepLines/>
+        <w:keepNext/>
       </w:pPr>
       <w:r>
         <w:rPr>
@@ -2763,6 +2897,7 @@
     <w:p>
       <w:pPr>
         <w:spacing w:before="0" w:after="120" w:line="240" w:lineRule="auto"/>
+        <w:keepLines/>
       </w:pPr>
       <w:r>
         <w:t>If the export UART format changes, update this file first.</w:t>
@@ -2772,6 +2907,8 @@
       <w:pPr>
         <w:pStyle w:val="Heading1"/>
         <w:spacing w:before="240" w:after="120"/>
+        <w:keepNext/>
+        <w:keepLines/>
       </w:pPr>
       <w:r>
         <w:t>Storage</w:t>
@@ -2780,6 +2917,8 @@
     <w:p>
       <w:pPr>
         <w:spacing w:before="0" w:after="120" w:line="240" w:lineRule="auto"/>
+        <w:keepLines/>
+        <w:keepNext/>
       </w:pPr>
       <w:r>
         <w:rPr>
@@ -2796,6 +2935,8 @@
     <w:p>
       <w:pPr>
         <w:pStyle w:val="ListBullet"/>
+        <w:keepLines/>
+        <w:keepNext/>
       </w:pPr>
       <w:r>
         <w:t>exports directory selection</w:t>
@@ -2804,6 +2945,8 @@
     <w:p>
       <w:pPr>
         <w:pStyle w:val="ListBullet"/>
+        <w:keepLines/>
+        <w:keepNext/>
       </w:pPr>
       <w:r>
         <w:t>CSV column names</w:t>
@@ -2812,6 +2955,8 @@
     <w:p>
       <w:pPr>
         <w:pStyle w:val="ListBullet"/>
+        <w:keepLines/>
+        <w:keepNext/>
       </w:pPr>
       <w:r>
         <w:t>settings persistence</w:t>
@@ -2820,6 +2965,7 @@
     <w:p>
       <w:pPr>
         <w:pStyle w:val="ListBullet"/>
+        <w:keepLines/>
       </w:pPr>
       <w:r>
         <w:t>last successful operation persistence</w:t>
@@ -2829,6 +2975,8 @@
       <w:pPr>
         <w:pStyle w:val="Heading1"/>
         <w:spacing w:before="240" w:after="120"/>
+        <w:keepNext/>
+        <w:keepLines/>
       </w:pPr>
       <w:r>
         <w:t>One Click</w:t>
@@ -2837,6 +2985,8 @@
     <w:p>
       <w:pPr>
         <w:spacing w:before="0" w:after="120" w:line="240" w:lineRule="auto"/>
+        <w:keepLines/>
+        <w:keepNext/>
       </w:pPr>
       <w:r>
         <w:rPr>
@@ -2853,6 +3003,8 @@
     <w:p>
       <w:pPr>
         <w:pStyle w:val="ListBullet"/>
+        <w:keepLines/>
+        <w:keepNext/>
       </w:pPr>
       <w:r>
         <w:t>the One Click worker</w:t>
@@ -2861,6 +3013,8 @@
     <w:p>
       <w:pPr>
         <w:pStyle w:val="ListBullet"/>
+        <w:keepLines/>
+        <w:keepNext/>
       </w:pPr>
       <w:r>
         <w:t>the app-side phase mapping</w:t>
@@ -2869,6 +3023,8 @@
     <w:p>
       <w:pPr>
         <w:pStyle w:val="ListBullet"/>
+        <w:keepLines/>
+        <w:keepNext/>
       </w:pPr>
       <w:r>
         <w:t>live Activity Log updates</w:t>
@@ -2877,6 +3033,8 @@
     <w:p>
       <w:pPr>
         <w:pStyle w:val="ListBullet"/>
+        <w:keepLines/>
+        <w:keepNext/>
       </w:pPr>
       <w:r>
         <w:t>UI lockouts during One Click</w:t>
@@ -2885,6 +3043,7 @@
     <w:p>
       <w:pPr>
         <w:spacing w:before="0" w:after="120" w:line="240" w:lineRule="auto"/>
+        <w:keepLines/>
       </w:pPr>
       <w:r>
         <w:t xml:space="preserve">The desktop app must continue to treat </w:t>
@@ -2905,6 +3064,8 @@
       <w:pPr>
         <w:pStyle w:val="Heading1"/>
         <w:spacing w:before="240" w:after="120"/>
+        <w:keepNext/>
+        <w:keepLines/>
       </w:pPr>
       <w:r>
         <w:t>7. Safe Change Checklist</w:t>
@@ -2913,6 +3074,7 @@
     <w:p>
       <w:pPr>
         <w:spacing w:before="0" w:after="120" w:line="240" w:lineRule="auto"/>
+        <w:keepLines/>
       </w:pPr>
       <w:r>
         <w:t>Before committing a behavior change, ask:</w:t>
@@ -2921,6 +3083,8 @@
     <w:p>
       <w:pPr>
         <w:pStyle w:val="ListBullet"/>
+        <w:keepLines/>
+        <w:keepNext/>
       </w:pPr>
       <w:r>
         <w:t>Does it change a protocol token?</w:t>
@@ -2929,6 +3093,8 @@
     <w:p>
       <w:pPr>
         <w:pStyle w:val="ListBullet"/>
+        <w:keepLines/>
+        <w:keepNext/>
       </w:pPr>
       <w:r>
         <w:t>Does it change a timing constant?</w:t>
@@ -2937,6 +3103,8 @@
     <w:p>
       <w:pPr>
         <w:pStyle w:val="ListBullet"/>
+        <w:keepLines/>
+        <w:keepNext/>
       </w:pPr>
       <w:r>
         <w:t>Does it change what the operator must do?</w:t>
@@ -2945,6 +3113,8 @@
     <w:p>
       <w:pPr>
         <w:pStyle w:val="ListBullet"/>
+        <w:keepLines/>
+        <w:keepNext/>
       </w:pPr>
       <w:r>
         <w:t>Does it change what One Click displays or blocks?</w:t>
@@ -2953,6 +3123,8 @@
     <w:p>
       <w:pPr>
         <w:pStyle w:val="ListBullet"/>
+        <w:keepLines/>
+        <w:keepNext/>
       </w:pPr>
       <w:r>
         <w:t>Does it change what gets written to CSV?</w:t>
@@ -2961,6 +3133,7 @@
     <w:p>
       <w:pPr>
         <w:pStyle w:val="ListBullet"/>
+        <w:keepLines/>
       </w:pPr>
       <w:r>
         <w:t>Does it change a fault code or fault text?</w:t>
@@ -2989,6 +3162,8 @@
       <w:pPr>
         <w:pStyle w:val="Heading1"/>
         <w:spacing w:before="240" w:after="120"/>
+        <w:keepNext/>
+        <w:keepLines/>
       </w:pPr>
       <w:r>
         <w:t>8. Current Known Constraints</w:t>
@@ -2997,6 +3172,8 @@
     <w:p>
       <w:pPr>
         <w:pStyle w:val="ListBullet"/>
+        <w:keepLines/>
+        <w:keepNext/>
       </w:pPr>
       <w:r>
         <w:t>Production firmware upload is not implemented in the desktop app.</w:t>
@@ -3005,6 +3182,8 @@
     <w:p>
       <w:pPr>
         <w:pStyle w:val="ListBullet"/>
+        <w:keepLines/>
+        <w:keepNext/>
       </w:pPr>
       <w:r>
         <w:t>Digital Output 1 and Digital Output 2 are not yet real validated output tests in the fixture flow.</w:t>
@@ -3013,6 +3192,7 @@
     <w:p>
       <w:pPr>
         <w:pStyle w:val="ListBullet"/>
+        <w:keepLines/>
       </w:pPr>
       <w:r>
         <w:t>The exported CSV contains human-readable test rows but not a raw fault-code column.</w:t>
@@ -3022,6 +3202,7 @@
       <w:pPr>
         <w:pStyle w:val="Heading1"/>
         <w:spacing w:before="240" w:after="120"/>
+        <w:keepLines/>
       </w:pPr>
       <w:r>
         <w:t>9. Recommended Validation After Changes</w:t>
@@ -3031,6 +3212,8 @@
       <w:pPr>
         <w:pStyle w:val="Heading1"/>
         <w:spacing w:before="240" w:after="120"/>
+        <w:keepNext/>
+        <w:keepLines/>
       </w:pPr>
       <w:r>
         <w:t>For STM32 Firmware Changes</w:t>
@@ -3039,6 +3222,8 @@
     <w:p>
       <w:pPr>
         <w:pStyle w:val="ListBullet"/>
+        <w:keepLines/>
+        <w:keepNext/>
       </w:pPr>
       <w:r>
         <w:t>Build the TouchGFX target</w:t>
@@ -3047,6 +3232,8 @@
     <w:p>
       <w:pPr>
         <w:pStyle w:val="ListBullet"/>
+        <w:keepLines/>
+        <w:keepNext/>
       </w:pPr>
       <w:r>
         <w:t>Confirm the expected screen transitions still occur</w:t>
@@ -3055,6 +3242,8 @@
     <w:p>
       <w:pPr>
         <w:pStyle w:val="ListBullet"/>
+        <w:keepLines/>
+        <w:keepNext/>
       </w:pPr>
       <w:r>
         <w:t xml:space="preserve">Confirm </w:t>
@@ -3074,6 +3263,7 @@
     <w:p>
       <w:pPr>
         <w:pStyle w:val="ListBullet"/>
+        <w:keepLines/>
       </w:pPr>
       <w:r>
         <w:t>Confirm export still works for pass and fail</w:t>
@@ -3083,6 +3273,8 @@
       <w:pPr>
         <w:pStyle w:val="Heading1"/>
         <w:spacing w:before="240" w:after="120"/>
+        <w:keepNext/>
+        <w:keepLines/>
       </w:pPr>
       <w:r>
         <w:t>For ESP32 Protocol Changes</w:t>
@@ -3091,6 +3283,8 @@
     <w:p>
       <w:pPr>
         <w:pStyle w:val="ListBullet"/>
+        <w:keepLines/>
+        <w:keepNext/>
       </w:pPr>
       <w:r>
         <w:t>Confirm the token strings still match the STM32 expectations exactly</w:t>
@@ -3099,6 +3293,8 @@
     <w:p>
       <w:pPr>
         <w:pStyle w:val="ListBullet"/>
+        <w:keepLines/>
+        <w:keepNext/>
       </w:pPr>
       <w:r>
         <w:t>Confirm negative acknowledgments still map cleanly to fault codes</w:t>
@@ -3107,6 +3303,7 @@
     <w:p>
       <w:pPr>
         <w:pStyle w:val="ListBullet"/>
+        <w:keepLines/>
       </w:pPr>
       <w:r>
         <w:t>Confirm analog reply formatting still matches STM32 parsing</w:t>
@@ -3116,6 +3313,8 @@
       <w:pPr>
         <w:pStyle w:val="Heading1"/>
         <w:spacing w:before="240" w:after="120"/>
+        <w:keepNext/>
+        <w:keepLines/>
       </w:pPr>
       <w:r>
         <w:t>For Desktop App Changes</w:t>
@@ -3124,6 +3323,8 @@
     <w:p>
       <w:pPr>
         <w:pStyle w:val="ListBullet"/>
+        <w:keepLines/>
+        <w:keepNext/>
       </w:pPr>
       <w:r>
         <w:t xml:space="preserve">Run </w:t>
@@ -3143,6 +3344,8 @@
     <w:p>
       <w:pPr>
         <w:pStyle w:val="ListBullet"/>
+        <w:keepLines/>
+        <w:keepNext/>
       </w:pPr>
       <w:r>
         <w:t>Verify manual extract</w:t>
@@ -3151,6 +3354,8 @@
     <w:p>
       <w:pPr>
         <w:pStyle w:val="ListBullet"/>
+        <w:keepLines/>
+        <w:keepNext/>
       </w:pPr>
       <w:r>
         <w:t>Verify test-firmware upload</w:t>
@@ -3159,6 +3364,7 @@
     <w:p>
       <w:pPr>
         <w:pStyle w:val="ListBullet"/>
+        <w:keepLines/>
       </w:pPr>
       <w:r>
         <w:t>Verify One Click start, live progress, LED wait, and final export</w:t>
@@ -3168,6 +3374,8 @@
       <w:pPr>
         <w:pStyle w:val="Heading1"/>
         <w:spacing w:before="240" w:after="120"/>
+        <w:keepNext/>
+        <w:keepLines/>
       </w:pPr>
       <w:r>
         <w:t>10. Documentation Rule</w:t>
@@ -3176,6 +3384,7 @@
     <w:p>
       <w:pPr>
         <w:spacing w:before="0" w:after="120" w:line="240" w:lineRule="auto"/>
+        <w:keepLines/>
       </w:pPr>
       <w:r>
         <w:t>Do not leave docs describing old behavior when the code has moved on.</w:t>
@@ -3192,6 +3401,8 @@
     <w:p>
       <w:pPr>
         <w:pStyle w:val="ListBullet"/>
+        <w:keepLines/>
+        <w:keepNext/>
       </w:pPr>
       <w:r>
         <w:t>fixture workflow</w:t>
@@ -3200,6 +3411,8 @@
     <w:p>
       <w:pPr>
         <w:pStyle w:val="ListBullet"/>
+        <w:keepLines/>
+        <w:keepNext/>
       </w:pPr>
       <w:r>
         <w:t>operator actions</w:t>
@@ -3208,6 +3421,8 @@
     <w:p>
       <w:pPr>
         <w:pStyle w:val="ListBullet"/>
+        <w:keepLines/>
+        <w:keepNext/>
       </w:pPr>
       <w:r>
         <w:t>export protocol</w:t>
@@ -3216,6 +3431,8 @@
     <w:p>
       <w:pPr>
         <w:pStyle w:val="ListBullet"/>
+        <w:keepLines/>
+        <w:keepNext/>
       </w:pPr>
       <w:r>
         <w:t>One Click behavior</w:t>
@@ -3224,6 +3441,8 @@
     <w:p>
       <w:pPr>
         <w:pStyle w:val="ListBullet"/>
+        <w:keepLines/>
+        <w:keepNext/>
       </w:pPr>
       <w:r>
         <w:t>active fault codes</w:t>
@@ -3232,6 +3451,7 @@
     <w:p>
       <w:pPr>
         <w:pStyle w:val="ListBullet"/>
+        <w:keepLines/>
       </w:pPr>
       <w:r>
         <w:t>hardware ownership</w:t>
@@ -3726,6 +3946,7 @@
     <w:pPr>
       <w:keepNext/>
       <w:keepLines/>
+      <w:widowControl w:val="0"/>
       <w:spacing w:before="480" w:after="0"/>
       <w:outlineLvl w:val="0"/>
     </w:pPr>
@@ -3750,6 +3971,7 @@
     <w:pPr>
       <w:keepNext/>
       <w:keepLines/>
+      <w:widowControl w:val="0"/>
       <w:spacing w:before="200" w:after="0"/>
       <w:outlineLvl w:val="1"/>
     </w:pPr>
@@ -3774,6 +3996,7 @@
     <w:pPr>
       <w:keepNext/>
       <w:keepLines/>
+      <w:widowControl w:val="0"/>
       <w:spacing w:before="200" w:after="0"/>
       <w:outlineLvl w:val="2"/>
     </w:pPr>
@@ -4013,10 +4236,13 @@
     <w:qFormat/>
     <w:rsid w:val="00FC693F"/>
     <w:pPr>
+      <w:keepNext/>
+      <w:keepLines/>
+      <w:widowControl w:val="0"/>
       <w:pBdr>
         <w:bottom w:val="single" w:sz="8" w:space="4" w:color="4F81BD" w:themeColor="accent1"/>
       </w:pBdr>
-      <w:spacing w:after="300" w:line="240" w:lineRule="auto"/>
+      <w:spacing w:after="0" w:line="240" w:lineRule="auto"/>
       <w:contextualSpacing/>
     </w:pPr>
     <w:rPr>
@@ -4053,9 +4279,13 @@
     <w:qFormat/>
     <w:rsid w:val="00FC693F"/>
     <w:pPr>
+      <w:keepNext/>
+      <w:keepLines/>
+      <w:widowControl w:val="0"/>
       <w:numPr>
         <w:ilvl w:val="1"/>
       </w:numPr>
+      <w:spacing w:after="0"/>
     </w:pPr>
     <w:rPr>
       <w:rFonts w:asciiTheme="majorHAnsi" w:eastAsiaTheme="majorEastAsia" w:hAnsiTheme="majorHAnsi" w:cstheme="majorBidi" w:ascii="Aptos" w:hAnsi="Aptos"/>
@@ -4197,6 +4427,8 @@
     <w:unhideWhenUsed/>
     <w:rsid w:val="00326F90"/>
     <w:pPr>
+      <w:keepLines/>
+      <w:widowControl w:val="0"/>
       <w:numPr>
         <w:numId w:val="1"/>
       </w:numPr>
@@ -4210,6 +4442,8 @@
     <w:unhideWhenUsed/>
     <w:rsid w:val="00326F90"/>
     <w:pPr>
+      <w:keepLines/>
+      <w:widowControl w:val="0"/>
       <w:numPr>
         <w:numId w:val="2"/>
       </w:numPr>
@@ -4236,6 +4470,8 @@
     <w:unhideWhenUsed/>
     <w:rsid w:val="00326F90"/>
     <w:pPr>
+      <w:keepLines/>
+      <w:widowControl w:val="0"/>
       <w:numPr>
         <w:numId w:val="5"/>
       </w:numPr>
@@ -4249,6 +4485,8 @@
     <w:unhideWhenUsed/>
     <w:rsid w:val="0029639D"/>
     <w:pPr>
+      <w:keepLines/>
+      <w:widowControl w:val="0"/>
       <w:numPr>
         <w:numId w:val="6"/>
       </w:numPr>

</xml_diff>